<commit_message>
Move spread files to single report folder + remove unused sketches
</commit_message>
<xml_diff>
--- a/proposta/Ratificacao-Gabriel Sartori Rangel.docx
+++ b/proposta/Ratificacao-Gabriel Sartori Rangel.docx
@@ -94,6 +94,8 @@
         <w:rPr>
           <w:b/>
         </w:rPr>
+        <w:t xml:space="preserve">( )  TCC1      </w:t>
+        <w:tab/>
         <w:t>(</w:t>
       </w:r>
       <w:r>
@@ -106,9 +108,7 @@
         <w:rPr>
           <w:b/>
         </w:rPr>
-        <w:t xml:space="preserve">)  TCC1      </w:t>
-        <w:tab/>
-        <w:t>(   ) TCC2</w:t>
+        <w:t>) TCC2</w:t>
       </w:r>
     </w:p>
     <w:p>
@@ -141,19 +141,7 @@
         <w:tab/>
         <w:tab/>
         <w:tab/>
-        <w:t>(</w:t>
-      </w:r>
-      <w:r>
-        <w:rPr>
-          <w:b/>
-        </w:rPr>
-        <w:t>X</w:t>
-      </w:r>
-      <w:r>
-        <w:rPr>
-          <w:b/>
-        </w:rPr>
-        <w:t>)  CCO</w:t>
+        <w:t>(X)  CCO</w:t>
         <w:tab/>
         <w:t>(   )  SIN</w:t>
         <w:tab/>
@@ -197,11 +185,7 @@
       </w:r>
       <w:r>
         <w:rPr/>
-        <w:t xml:space="preserve">   Gabriel </w:t>
-      </w:r>
-      <w:r>
-        <w:rPr/>
-        <w:t>Sartori Rangel</w:t>
+        <w:t xml:space="preserve">   Gabriel Sartori Rangel</w:t>
       </w:r>
     </w:p>
     <w:p>
@@ -271,11 +255,6 @@
           <w:b/>
         </w:rPr>
         <w:tab/>
-      </w:r>
-      <w:r>
-        <w:rPr>
-          <w:b/>
-        </w:rPr>
         <w:t>Objetivo Geral:</w:t>
       </w:r>
       <w:r>
@@ -283,14 +262,7 @@
           <w:b w:val="false"/>
           <w:bCs w:val="false"/>
         </w:rPr>
-        <w:t xml:space="preserve"> </w:t>
-      </w:r>
-      <w:r>
-        <w:rPr>
-          <w:b w:val="false"/>
-          <w:bCs w:val="false"/>
-        </w:rPr>
-        <w:t>Implementar um simulador de circuitos quânticos de baixo consumo de memória por meio da estrutura de diagramas de decisão e integrar esse simulador na plataforma de desenvolvimento de circuitos quânticos Ket.</w:t>
+        <w:t xml:space="preserve"> Implementar um simulador de circuitos quânticos de baixo consumo de memória por meio da estrutura de diagramas de decisão e integrar esse simulador na plataforma de desenvolvimento de circuitos quânticos Ket.</w:t>
       </w:r>
     </w:p>
     <w:p>
@@ -337,15 +309,7 @@
       </w:pPr>
       <w:r>
         <w:rPr/>
-        <w:t xml:space="preserve">Pesquisar sobre </w:t>
-      </w:r>
-      <w:r>
-        <w:rPr/>
-        <w:t xml:space="preserve">diagramas de decisão quânticos </w:t>
-      </w:r>
-      <w:r>
-        <w:rPr/>
-        <w:t>para simulação de circuitos quânticos.</w:t>
+        <w:t>Pesquisar sobre diagramas de decisão quânticos para simulação de circuitos quânticos.</w:t>
       </w:r>
     </w:p>
     <w:p>
@@ -360,23 +324,7 @@
       </w:pPr>
       <w:r>
         <w:rPr/>
-        <w:t xml:space="preserve">Implementar um simulador </w:t>
-      </w:r>
-      <w:r>
-        <w:rPr/>
-        <w:t xml:space="preserve">para </w:t>
-      </w:r>
-      <w:r>
-        <w:rPr/>
-        <w:t xml:space="preserve">circuitos </w:t>
-      </w:r>
-      <w:r>
-        <w:rPr/>
-        <w:t>generalizados</w:t>
-      </w:r>
-      <w:r>
-        <w:rPr/>
-        <w:t xml:space="preserve"> no Ket.</w:t>
+        <w:t>Implementar um simulador para circuitos generalizados no Ket.</w:t>
       </w:r>
     </w:p>
     <w:p>
@@ -428,18 +376,18 @@
         </w:tblCellMar>
       </w:tblPr>
       <w:tblGrid>
-        <w:gridCol w:w="5055"/>
-        <w:gridCol w:w="735"/>
-        <w:gridCol w:w="1080"/>
+        <w:gridCol w:w="5054"/>
+        <w:gridCol w:w="736"/>
+        <w:gridCol w:w="1079"/>
         <w:gridCol w:w="960"/>
-        <w:gridCol w:w="1080"/>
+        <w:gridCol w:w="1081"/>
         <w:gridCol w:w="1068"/>
       </w:tblGrid>
       <w:tr>
         <w:trPr/>
         <w:tc>
           <w:tcPr>
-            <w:tcW w:w="5055" w:type="dxa"/>
+            <w:tcW w:w="5054" w:type="dxa"/>
             <w:vMerge w:val="restart"/>
             <w:tcBorders>
               <w:top w:val="single" w:sz="4" w:space="0" w:color="000000"/>
@@ -473,7 +421,7 @@
         </w:tc>
         <w:tc>
           <w:tcPr>
-            <w:tcW w:w="4923" w:type="dxa"/>
+            <w:tcW w:w="4924" w:type="dxa"/>
             <w:gridSpan w:val="5"/>
             <w:tcBorders>
               <w:top w:val="single" w:sz="4" w:space="0" w:color="000000"/>
@@ -492,15 +440,7 @@
             </w:pPr>
             <w:r>
               <w:rPr/>
-              <w:t>20</w:t>
-            </w:r>
-            <w:r>
-              <w:rPr/>
-              <w:t>2</w:t>
-            </w:r>
-            <w:r>
-              <w:rPr/>
-              <w:t>5</w:t>
+              <w:t>2025</w:t>
             </w:r>
           </w:p>
         </w:tc>
@@ -509,7 +449,7 @@
         <w:trPr/>
         <w:tc>
           <w:tcPr>
-            <w:tcW w:w="5055" w:type="dxa"/>
+            <w:tcW w:w="5054" w:type="dxa"/>
             <w:vMerge w:val="continue"/>
             <w:tcBorders>
               <w:top w:val="single" w:sz="4" w:space="0" w:color="000000"/>
@@ -533,7 +473,7 @@
         </w:tc>
         <w:tc>
           <w:tcPr>
-            <w:tcW w:w="735" w:type="dxa"/>
+            <w:tcW w:w="736" w:type="dxa"/>
             <w:tcBorders>
               <w:start w:val="single" w:sz="4" w:space="0" w:color="000000"/>
               <w:bottom w:val="single" w:sz="4" w:space="0" w:color="000000"/>
@@ -554,7 +494,7 @@
         </w:tc>
         <w:tc>
           <w:tcPr>
-            <w:tcW w:w="1080" w:type="dxa"/>
+            <w:tcW w:w="1079" w:type="dxa"/>
             <w:tcBorders>
               <w:start w:val="single" w:sz="4" w:space="0" w:color="000000"/>
               <w:bottom w:val="single" w:sz="4" w:space="0" w:color="000000"/>
@@ -596,7 +536,7 @@
         </w:tc>
         <w:tc>
           <w:tcPr>
-            <w:tcW w:w="1080" w:type="dxa"/>
+            <w:tcW w:w="1081" w:type="dxa"/>
             <w:tcBorders>
               <w:start w:val="single" w:sz="4" w:space="0" w:color="000000"/>
               <w:bottom w:val="single" w:sz="4" w:space="0" w:color="000000"/>
@@ -642,27 +582,27 @@
         <w:trPr/>
         <w:tc>
           <w:tcPr>
-            <w:tcW w:w="5055" w:type="dxa"/>
-            <w:tcBorders>
-              <w:start w:val="single" w:sz="4" w:space="0" w:color="000000"/>
-              <w:bottom w:val="single" w:sz="4" w:space="0" w:color="000000"/>
-            </w:tcBorders>
-          </w:tcPr>
-          <w:p>
-            <w:pPr>
-              <w:pStyle w:val="TableContents"/>
-              <w:spacing w:before="0" w:after="200"/>
-              <w:rPr/>
-            </w:pPr>
-            <w:r>
-              <w:rPr/>
-              <w:t>Revisão Bibliográfica</w:t>
-            </w:r>
-          </w:p>
-        </w:tc>
-        <w:tc>
-          <w:tcPr>
-            <w:tcW w:w="735" w:type="dxa"/>
+            <w:tcW w:w="5054" w:type="dxa"/>
+            <w:tcBorders>
+              <w:start w:val="single" w:sz="4" w:space="0" w:color="000000"/>
+              <w:bottom w:val="single" w:sz="4" w:space="0" w:color="000000"/>
+            </w:tcBorders>
+          </w:tcPr>
+          <w:p>
+            <w:pPr>
+              <w:pStyle w:val="TableContents"/>
+              <w:spacing w:before="0" w:after="200"/>
+              <w:rPr/>
+            </w:pPr>
+            <w:r>
+              <w:rPr/>
+              <w:t>Implementação dos algoritmos</w:t>
+            </w:r>
+          </w:p>
+        </w:tc>
+        <w:tc>
+          <w:tcPr>
+            <w:tcW w:w="736" w:type="dxa"/>
             <w:tcBorders>
               <w:start w:val="single" w:sz="4" w:space="0" w:color="000000"/>
               <w:bottom w:val="single" w:sz="4" w:space="0" w:color="000000"/>
@@ -683,7 +623,7 @@
         </w:tc>
         <w:tc>
           <w:tcPr>
-            <w:tcW w:w="1080" w:type="dxa"/>
+            <w:tcW w:w="1079" w:type="dxa"/>
             <w:tcBorders>
               <w:start w:val="single" w:sz="4" w:space="0" w:color="000000"/>
               <w:bottom w:val="single" w:sz="4" w:space="0" w:color="000000"/>
@@ -724,7 +664,7 @@
         </w:tc>
         <w:tc>
           <w:tcPr>
-            <w:tcW w:w="1080" w:type="dxa"/>
+            <w:tcW w:w="1081" w:type="dxa"/>
             <w:tcBorders>
               <w:start w:val="single" w:sz="4" w:space="0" w:color="000000"/>
               <w:bottom w:val="single" w:sz="4" w:space="0" w:color="000000"/>
@@ -768,31 +708,27 @@
         <w:trPr/>
         <w:tc>
           <w:tcPr>
-            <w:tcW w:w="5055" w:type="dxa"/>
-            <w:tcBorders>
-              <w:start w:val="single" w:sz="4" w:space="0" w:color="000000"/>
-              <w:bottom w:val="single" w:sz="4" w:space="0" w:color="000000"/>
-            </w:tcBorders>
-          </w:tcPr>
-          <w:p>
-            <w:pPr>
-              <w:pStyle w:val="TableContents"/>
-              <w:spacing w:before="0" w:after="200"/>
-              <w:rPr/>
-            </w:pPr>
-            <w:r>
-              <w:rPr/>
-              <w:t>Pesquisa do</w:t>
-            </w:r>
-            <w:r>
-              <w:rPr/>
-              <w:t>s Diagramas de Decisão</w:t>
-            </w:r>
-          </w:p>
-        </w:tc>
-        <w:tc>
-          <w:tcPr>
-            <w:tcW w:w="735" w:type="dxa"/>
+            <w:tcW w:w="5054" w:type="dxa"/>
+            <w:tcBorders>
+              <w:start w:val="single" w:sz="4" w:space="0" w:color="000000"/>
+              <w:bottom w:val="single" w:sz="4" w:space="0" w:color="000000"/>
+            </w:tcBorders>
+          </w:tcPr>
+          <w:p>
+            <w:pPr>
+              <w:pStyle w:val="TableContents"/>
+              <w:spacing w:before="0" w:after="200"/>
+              <w:rPr/>
+            </w:pPr>
+            <w:r>
+              <w:rPr/>
+              <w:t>Definição de circuitos a serem simulados</w:t>
+            </w:r>
+          </w:p>
+        </w:tc>
+        <w:tc>
+          <w:tcPr>
+            <w:tcW w:w="736" w:type="dxa"/>
             <w:tcBorders>
               <w:start w:val="single" w:sz="4" w:space="0" w:color="000000"/>
               <w:bottom w:val="single" w:sz="4" w:space="0" w:color="000000"/>
@@ -813,7 +749,7 @@
         </w:tc>
         <w:tc>
           <w:tcPr>
-            <w:tcW w:w="1080" w:type="dxa"/>
+            <w:tcW w:w="1079" w:type="dxa"/>
             <w:tcBorders>
               <w:start w:val="single" w:sz="4" w:space="0" w:color="000000"/>
               <w:bottom w:val="single" w:sz="4" w:space="0" w:color="000000"/>
@@ -854,7 +790,7 @@
         </w:tc>
         <w:tc>
           <w:tcPr>
-            <w:tcW w:w="1080" w:type="dxa"/>
+            <w:tcW w:w="1081" w:type="dxa"/>
             <w:tcBorders>
               <w:start w:val="single" w:sz="4" w:space="0" w:color="000000"/>
               <w:bottom w:val="single" w:sz="4" w:space="0" w:color="000000"/>
@@ -898,51 +834,47 @@
         <w:trPr/>
         <w:tc>
           <w:tcPr>
-            <w:tcW w:w="5055" w:type="dxa"/>
-            <w:tcBorders>
-              <w:start w:val="single" w:sz="4" w:space="0" w:color="000000"/>
-              <w:bottom w:val="single" w:sz="4" w:space="0" w:color="000000"/>
-            </w:tcBorders>
-          </w:tcPr>
-          <w:p>
-            <w:pPr>
-              <w:pStyle w:val="TableContents"/>
-              <w:spacing w:before="0" w:after="200"/>
-              <w:rPr/>
-            </w:pPr>
-            <w:r>
-              <w:rPr/>
-              <w:t xml:space="preserve">Escrita </w:t>
-            </w:r>
-            <w:r>
-              <w:rPr/>
-              <w:t>da fundamentação teórica</w:t>
-            </w:r>
-          </w:p>
-        </w:tc>
-        <w:tc>
-          <w:tcPr>
-            <w:tcW w:w="735" w:type="dxa"/>
-            <w:tcBorders>
-              <w:start w:val="single" w:sz="4" w:space="0" w:color="000000"/>
-              <w:bottom w:val="single" w:sz="4" w:space="0" w:color="000000"/>
-            </w:tcBorders>
-          </w:tcPr>
-          <w:p>
-            <w:pPr>
-              <w:pStyle w:val="TableContents"/>
-              <w:spacing w:before="0" w:after="200"/>
-              <w:jc w:val="center"/>
-              <w:rPr/>
-            </w:pPr>
-            <w:r>
-              <w:rPr/>
-            </w:r>
-          </w:p>
-        </w:tc>
-        <w:tc>
-          <w:tcPr>
-            <w:tcW w:w="1080" w:type="dxa"/>
+            <w:tcW w:w="5054" w:type="dxa"/>
+            <w:tcBorders>
+              <w:start w:val="single" w:sz="4" w:space="0" w:color="000000"/>
+              <w:bottom w:val="single" w:sz="4" w:space="0" w:color="000000"/>
+            </w:tcBorders>
+          </w:tcPr>
+          <w:p>
+            <w:pPr>
+              <w:pStyle w:val="TableContents"/>
+              <w:spacing w:before="0" w:after="200"/>
+              <w:rPr/>
+            </w:pPr>
+            <w:r>
+              <w:rPr/>
+              <w:t>Simulação dos algoritmos e documentação dos resultados</w:t>
+            </w:r>
+          </w:p>
+        </w:tc>
+        <w:tc>
+          <w:tcPr>
+            <w:tcW w:w="736" w:type="dxa"/>
+            <w:tcBorders>
+              <w:start w:val="single" w:sz="4" w:space="0" w:color="000000"/>
+              <w:bottom w:val="single" w:sz="4" w:space="0" w:color="000000"/>
+            </w:tcBorders>
+          </w:tcPr>
+          <w:p>
+            <w:pPr>
+              <w:pStyle w:val="TableContents"/>
+              <w:spacing w:before="0" w:after="200"/>
+              <w:jc w:val="center"/>
+              <w:rPr/>
+            </w:pPr>
+            <w:r>
+              <w:rPr/>
+            </w:r>
+          </w:p>
+        </w:tc>
+        <w:tc>
+          <w:tcPr>
+            <w:tcW w:w="1079" w:type="dxa"/>
             <w:tcBorders>
               <w:start w:val="single" w:sz="4" w:space="0" w:color="000000"/>
               <w:bottom w:val="single" w:sz="4" w:space="0" w:color="000000"/>
@@ -984,22 +916,21 @@
         </w:tc>
         <w:tc>
           <w:tcPr>
-            <w:tcW w:w="1080" w:type="dxa"/>
-            <w:tcBorders>
-              <w:start w:val="single" w:sz="4" w:space="0" w:color="000000"/>
-              <w:bottom w:val="single" w:sz="4" w:space="0" w:color="000000"/>
-            </w:tcBorders>
-          </w:tcPr>
-          <w:p>
-            <w:pPr>
-              <w:pStyle w:val="TableContents"/>
-              <w:spacing w:before="0" w:after="200"/>
-              <w:jc w:val="center"/>
-              <w:rPr/>
-            </w:pPr>
-            <w:r>
-              <w:rPr/>
-              <w:t>X</w:t>
+            <w:tcW w:w="1081" w:type="dxa"/>
+            <w:tcBorders>
+              <w:start w:val="single" w:sz="4" w:space="0" w:color="000000"/>
+              <w:bottom w:val="single" w:sz="4" w:space="0" w:color="000000"/>
+            </w:tcBorders>
+          </w:tcPr>
+          <w:p>
+            <w:pPr>
+              <w:pStyle w:val="TableContents"/>
+              <w:spacing w:before="0" w:after="200"/>
+              <w:jc w:val="center"/>
+              <w:rPr/>
+            </w:pPr>
+            <w:r>
+              <w:rPr/>
             </w:r>
           </w:p>
         </w:tc>
@@ -1021,7 +952,6 @@
             </w:pPr>
             <w:r>
               <w:rPr/>
-              <w:t>X</w:t>
             </w:r>
           </w:p>
         </w:tc>
@@ -1030,31 +960,67 @@
         <w:trPr/>
         <w:tc>
           <w:tcPr>
-            <w:tcW w:w="5055" w:type="dxa"/>
-            <w:tcBorders>
-              <w:start w:val="single" w:sz="4" w:space="0" w:color="000000"/>
-              <w:bottom w:val="single" w:sz="4" w:space="0" w:color="000000"/>
-            </w:tcBorders>
-          </w:tcPr>
-          <w:p>
-            <w:pPr>
-              <w:pStyle w:val="TableContents"/>
-              <w:spacing w:before="0" w:after="200"/>
-              <w:rPr/>
-            </w:pPr>
-            <w:r>
-              <w:rPr/>
-              <w:t xml:space="preserve">Implementação </w:t>
-            </w:r>
-            <w:r>
-              <w:rPr/>
-              <w:t>da aplicação de portas quânticas sobre o diagrama.</w:t>
-            </w:r>
-          </w:p>
-        </w:tc>
-        <w:tc>
-          <w:tcPr>
-            <w:tcW w:w="735" w:type="dxa"/>
+            <w:tcW w:w="5054" w:type="dxa"/>
+            <w:tcBorders>
+              <w:start w:val="single" w:sz="4" w:space="0" w:color="000000"/>
+              <w:bottom w:val="single" w:sz="4" w:space="0" w:color="000000"/>
+            </w:tcBorders>
+          </w:tcPr>
+          <w:p>
+            <w:pPr>
+              <w:pStyle w:val="TableContents"/>
+              <w:spacing w:before="0" w:after="200"/>
+              <w:rPr/>
+            </w:pPr>
+            <w:r>
+              <w:rPr/>
+              <w:t>Integração com o Ket</w:t>
+            </w:r>
+          </w:p>
+        </w:tc>
+        <w:tc>
+          <w:tcPr>
+            <w:tcW w:w="736" w:type="dxa"/>
+            <w:tcBorders>
+              <w:start w:val="single" w:sz="4" w:space="0" w:color="000000"/>
+              <w:bottom w:val="single" w:sz="4" w:space="0" w:color="000000"/>
+            </w:tcBorders>
+          </w:tcPr>
+          <w:p>
+            <w:pPr>
+              <w:pStyle w:val="TableContents"/>
+              <w:spacing w:before="0" w:after="200"/>
+              <w:jc w:val="center"/>
+              <w:rPr/>
+            </w:pPr>
+            <w:r>
+              <w:rPr/>
+            </w:r>
+          </w:p>
+        </w:tc>
+        <w:tc>
+          <w:tcPr>
+            <w:tcW w:w="1079" w:type="dxa"/>
+            <w:tcBorders>
+              <w:start w:val="single" w:sz="4" w:space="0" w:color="000000"/>
+              <w:bottom w:val="single" w:sz="4" w:space="0" w:color="000000"/>
+            </w:tcBorders>
+          </w:tcPr>
+          <w:p>
+            <w:pPr>
+              <w:pStyle w:val="TableContents"/>
+              <w:spacing w:before="0" w:after="200"/>
+              <w:jc w:val="center"/>
+              <w:rPr/>
+            </w:pPr>
+            <w:r>
+              <w:rPr/>
+            </w:r>
+          </w:p>
+        </w:tc>
+        <w:tc>
+          <w:tcPr>
+            <w:tcW w:w="960" w:type="dxa"/>
             <w:tcBorders>
               <w:start w:val="single" w:sz="4" w:space="0" w:color="000000"/>
               <w:bottom w:val="single" w:sz="4" w:space="0" w:color="000000"/>
@@ -1075,7 +1041,7 @@
         </w:tc>
         <w:tc>
           <w:tcPr>
-            <w:tcW w:w="1080" w:type="dxa"/>
+            <w:tcW w:w="1081" w:type="dxa"/>
             <w:tcBorders>
               <w:start w:val="single" w:sz="4" w:space="0" w:color="000000"/>
               <w:bottom w:val="single" w:sz="4" w:space="0" w:color="000000"/>
@@ -1091,47 +1057,6 @@
             <w:r>
               <w:rPr/>
               <w:t>X</w:t>
-            </w:r>
-          </w:p>
-        </w:tc>
-        <w:tc>
-          <w:tcPr>
-            <w:tcW w:w="960" w:type="dxa"/>
-            <w:tcBorders>
-              <w:start w:val="single" w:sz="4" w:space="0" w:color="000000"/>
-              <w:bottom w:val="single" w:sz="4" w:space="0" w:color="000000"/>
-            </w:tcBorders>
-          </w:tcPr>
-          <w:p>
-            <w:pPr>
-              <w:pStyle w:val="TableContents"/>
-              <w:spacing w:before="0" w:after="200"/>
-              <w:jc w:val="center"/>
-              <w:rPr/>
-            </w:pPr>
-            <w:r>
-              <w:rPr/>
-              <w:t>X</w:t>
-            </w:r>
-          </w:p>
-        </w:tc>
-        <w:tc>
-          <w:tcPr>
-            <w:tcW w:w="1080" w:type="dxa"/>
-            <w:tcBorders>
-              <w:start w:val="single" w:sz="4" w:space="0" w:color="000000"/>
-              <w:bottom w:val="single" w:sz="4" w:space="0" w:color="000000"/>
-            </w:tcBorders>
-          </w:tcPr>
-          <w:p>
-            <w:pPr>
-              <w:pStyle w:val="TableContents"/>
-              <w:spacing w:before="0" w:after="200"/>
-              <w:jc w:val="center"/>
-              <w:rPr/>
-            </w:pPr>
-            <w:r>
-              <w:rPr/>
             </w:r>
           </w:p>
         </w:tc>
@@ -1161,51 +1086,47 @@
         <w:trPr/>
         <w:tc>
           <w:tcPr>
-            <w:tcW w:w="5055" w:type="dxa"/>
-            <w:tcBorders>
-              <w:start w:val="single" w:sz="4" w:space="0" w:color="000000"/>
-              <w:bottom w:val="single" w:sz="4" w:space="0" w:color="000000"/>
-            </w:tcBorders>
-          </w:tcPr>
-          <w:p>
-            <w:pPr>
-              <w:pStyle w:val="TableContents"/>
-              <w:spacing w:before="0" w:after="200"/>
-              <w:rPr/>
-            </w:pPr>
-            <w:r>
-              <w:rPr/>
-              <w:t xml:space="preserve">Implementação da </w:t>
-            </w:r>
-            <w:r>
-              <w:rPr/>
-              <w:t>medição de um qubit no diagrama.</w:t>
-            </w:r>
-          </w:p>
-        </w:tc>
-        <w:tc>
-          <w:tcPr>
-            <w:tcW w:w="735" w:type="dxa"/>
-            <w:tcBorders>
-              <w:start w:val="single" w:sz="4" w:space="0" w:color="000000"/>
-              <w:bottom w:val="single" w:sz="4" w:space="0" w:color="000000"/>
-            </w:tcBorders>
-          </w:tcPr>
-          <w:p>
-            <w:pPr>
-              <w:pStyle w:val="TableContents"/>
-              <w:spacing w:before="0" w:after="200"/>
-              <w:jc w:val="center"/>
-              <w:rPr/>
-            </w:pPr>
-            <w:r>
-              <w:rPr/>
-            </w:r>
-          </w:p>
-        </w:tc>
-        <w:tc>
-          <w:tcPr>
-            <w:tcW w:w="1080" w:type="dxa"/>
+            <w:tcW w:w="5054" w:type="dxa"/>
+            <w:tcBorders>
+              <w:start w:val="single" w:sz="4" w:space="0" w:color="000000"/>
+              <w:bottom w:val="single" w:sz="4" w:space="0" w:color="000000"/>
+            </w:tcBorders>
+          </w:tcPr>
+          <w:p>
+            <w:pPr>
+              <w:pStyle w:val="TableContents"/>
+              <w:spacing w:before="0" w:after="200"/>
+              <w:rPr/>
+            </w:pPr>
+            <w:r>
+              <w:rPr/>
+              <w:t>Finalizar Monografia</w:t>
+            </w:r>
+          </w:p>
+        </w:tc>
+        <w:tc>
+          <w:tcPr>
+            <w:tcW w:w="736" w:type="dxa"/>
+            <w:tcBorders>
+              <w:start w:val="single" w:sz="4" w:space="0" w:color="000000"/>
+              <w:bottom w:val="single" w:sz="4" w:space="0" w:color="000000"/>
+            </w:tcBorders>
+          </w:tcPr>
+          <w:p>
+            <w:pPr>
+              <w:pStyle w:val="TableContents"/>
+              <w:spacing w:before="0" w:after="200"/>
+              <w:jc w:val="center"/>
+              <w:rPr/>
+            </w:pPr>
+            <w:r>
+              <w:rPr/>
+            </w:r>
+          </w:p>
+        </w:tc>
+        <w:tc>
+          <w:tcPr>
+            <w:tcW w:w="1079" w:type="dxa"/>
             <w:tcBorders>
               <w:start w:val="single" w:sz="4" w:space="0" w:color="000000"/>
               <w:bottom w:val="single" w:sz="4" w:space="0" w:color="000000"/>
@@ -1240,12 +1161,13 @@
             </w:pPr>
             <w:r>
               <w:rPr/>
-            </w:r>
-          </w:p>
-        </w:tc>
-        <w:tc>
-          <w:tcPr>
-            <w:tcW w:w="1080" w:type="dxa"/>
+              <w:t>X</w:t>
+            </w:r>
+          </w:p>
+        </w:tc>
+        <w:tc>
+          <w:tcPr>
+            <w:tcW w:w="1081" w:type="dxa"/>
             <w:tcBorders>
               <w:start w:val="single" w:sz="4" w:space="0" w:color="000000"/>
               <w:bottom w:val="single" w:sz="4" w:space="0" w:color="000000"/>
@@ -1290,55 +1212,47 @@
         <w:trPr/>
         <w:tc>
           <w:tcPr>
-            <w:tcW w:w="5055" w:type="dxa"/>
-            <w:tcBorders>
-              <w:start w:val="single" w:sz="4" w:space="0" w:color="000000"/>
-              <w:bottom w:val="single" w:sz="4" w:space="0" w:color="000000"/>
-            </w:tcBorders>
-          </w:tcPr>
-          <w:p>
-            <w:pPr>
-              <w:pStyle w:val="TableContents"/>
-              <w:spacing w:before="0" w:after="200"/>
-              <w:rPr/>
-            </w:pPr>
-            <w:r>
-              <w:rPr/>
-              <w:t xml:space="preserve">Escrita </w:t>
-            </w:r>
-            <w:r>
-              <w:rPr/>
-              <w:t xml:space="preserve">parcial </w:t>
-            </w:r>
-            <w:r>
-              <w:rPr/>
-              <w:t>do desenvolvimento</w:t>
-            </w:r>
-          </w:p>
-        </w:tc>
-        <w:tc>
-          <w:tcPr>
-            <w:tcW w:w="735" w:type="dxa"/>
-            <w:tcBorders>
-              <w:start w:val="single" w:sz="4" w:space="0" w:color="000000"/>
-              <w:bottom w:val="single" w:sz="4" w:space="0" w:color="000000"/>
-            </w:tcBorders>
-          </w:tcPr>
-          <w:p>
-            <w:pPr>
-              <w:pStyle w:val="TableContents"/>
-              <w:spacing w:before="0" w:after="200"/>
-              <w:jc w:val="center"/>
-              <w:rPr/>
-            </w:pPr>
-            <w:r>
-              <w:rPr/>
-            </w:r>
-          </w:p>
-        </w:tc>
-        <w:tc>
-          <w:tcPr>
-            <w:tcW w:w="1080" w:type="dxa"/>
+            <w:tcW w:w="5054" w:type="dxa"/>
+            <w:tcBorders>
+              <w:start w:val="single" w:sz="4" w:space="0" w:color="000000"/>
+              <w:bottom w:val="single" w:sz="4" w:space="0" w:color="000000"/>
+            </w:tcBorders>
+          </w:tcPr>
+          <w:p>
+            <w:pPr>
+              <w:pStyle w:val="TableContents"/>
+              <w:spacing w:before="0" w:after="200"/>
+              <w:rPr/>
+            </w:pPr>
+            <w:r>
+              <w:rPr/>
+              <w:t>Revisão da escrita</w:t>
+            </w:r>
+          </w:p>
+        </w:tc>
+        <w:tc>
+          <w:tcPr>
+            <w:tcW w:w="736" w:type="dxa"/>
+            <w:tcBorders>
+              <w:start w:val="single" w:sz="4" w:space="0" w:color="000000"/>
+              <w:bottom w:val="single" w:sz="4" w:space="0" w:color="000000"/>
+            </w:tcBorders>
+          </w:tcPr>
+          <w:p>
+            <w:pPr>
+              <w:pStyle w:val="TableContents"/>
+              <w:spacing w:before="0" w:after="200"/>
+              <w:jc w:val="center"/>
+              <w:rPr/>
+            </w:pPr>
+            <w:r>
+              <w:rPr/>
+            </w:r>
+          </w:p>
+        </w:tc>
+        <w:tc>
+          <w:tcPr>
+            <w:tcW w:w="1079" w:type="dxa"/>
             <w:tcBorders>
               <w:start w:val="single" w:sz="4" w:space="0" w:color="000000"/>
               <w:bottom w:val="single" w:sz="4" w:space="0" w:color="000000"/>
@@ -1373,13 +1287,12 @@
             </w:pPr>
             <w:r>
               <w:rPr/>
-              <w:t>X</w:t>
-            </w:r>
-          </w:p>
-        </w:tc>
-        <w:tc>
-          <w:tcPr>
-            <w:tcW w:w="1080" w:type="dxa"/>
+            </w:r>
+          </w:p>
+        </w:tc>
+        <w:tc>
+          <w:tcPr>
+            <w:tcW w:w="1081" w:type="dxa"/>
             <w:tcBorders>
               <w:start w:val="single" w:sz="4" w:space="0" w:color="000000"/>
               <w:bottom w:val="single" w:sz="4" w:space="0" w:color="000000"/>
@@ -1425,47 +1338,47 @@
         <w:trPr/>
         <w:tc>
           <w:tcPr>
-            <w:tcW w:w="5055" w:type="dxa"/>
-            <w:tcBorders>
-              <w:start w:val="single" w:sz="4" w:space="0" w:color="000000"/>
-              <w:bottom w:val="single" w:sz="4" w:space="0" w:color="000000"/>
-            </w:tcBorders>
-          </w:tcPr>
-          <w:p>
-            <w:pPr>
-              <w:pStyle w:val="TableContents"/>
-              <w:spacing w:before="0" w:after="200"/>
-              <w:rPr/>
-            </w:pPr>
-            <w:r>
-              <w:rPr/>
-              <w:t>Integração parcial com o Ket</w:t>
-            </w:r>
-          </w:p>
-        </w:tc>
-        <w:tc>
-          <w:tcPr>
-            <w:tcW w:w="735" w:type="dxa"/>
-            <w:tcBorders>
-              <w:start w:val="single" w:sz="4" w:space="0" w:color="000000"/>
-              <w:bottom w:val="single" w:sz="4" w:space="0" w:color="000000"/>
-            </w:tcBorders>
-          </w:tcPr>
-          <w:p>
-            <w:pPr>
-              <w:pStyle w:val="TableContents"/>
-              <w:spacing w:before="0" w:after="200"/>
-              <w:jc w:val="center"/>
-              <w:rPr/>
-            </w:pPr>
-            <w:r>
-              <w:rPr/>
-            </w:r>
-          </w:p>
-        </w:tc>
-        <w:tc>
-          <w:tcPr>
-            <w:tcW w:w="1080" w:type="dxa"/>
+            <w:tcW w:w="5054" w:type="dxa"/>
+            <w:tcBorders>
+              <w:start w:val="single" w:sz="4" w:space="0" w:color="000000"/>
+              <w:bottom w:val="single" w:sz="4" w:space="0" w:color="000000"/>
+            </w:tcBorders>
+          </w:tcPr>
+          <w:p>
+            <w:pPr>
+              <w:pStyle w:val="TableContents"/>
+              <w:spacing w:before="0" w:after="200"/>
+              <w:rPr/>
+            </w:pPr>
+            <w:r>
+              <w:rPr/>
+              <w:t>Defesa</w:t>
+            </w:r>
+          </w:p>
+        </w:tc>
+        <w:tc>
+          <w:tcPr>
+            <w:tcW w:w="736" w:type="dxa"/>
+            <w:tcBorders>
+              <w:start w:val="single" w:sz="4" w:space="0" w:color="000000"/>
+              <w:bottom w:val="single" w:sz="4" w:space="0" w:color="000000"/>
+            </w:tcBorders>
+          </w:tcPr>
+          <w:p>
+            <w:pPr>
+              <w:pStyle w:val="TableContents"/>
+              <w:spacing w:before="0" w:after="200"/>
+              <w:jc w:val="center"/>
+              <w:rPr/>
+            </w:pPr>
+            <w:r>
+              <w:rPr/>
+            </w:r>
+          </w:p>
+        </w:tc>
+        <w:tc>
+          <w:tcPr>
+            <w:tcW w:w="1079" w:type="dxa"/>
             <w:tcBorders>
               <w:start w:val="single" w:sz="4" w:space="0" w:color="000000"/>
               <w:bottom w:val="single" w:sz="4" w:space="0" w:color="000000"/>
@@ -1505,22 +1418,21 @@
         </w:tc>
         <w:tc>
           <w:tcPr>
-            <w:tcW w:w="1080" w:type="dxa"/>
-            <w:tcBorders>
-              <w:start w:val="single" w:sz="4" w:space="0" w:color="000000"/>
-              <w:bottom w:val="single" w:sz="4" w:space="0" w:color="000000"/>
-            </w:tcBorders>
-          </w:tcPr>
-          <w:p>
-            <w:pPr>
-              <w:pStyle w:val="TableContents"/>
-              <w:spacing w:before="0" w:after="200"/>
-              <w:jc w:val="center"/>
-              <w:rPr/>
-            </w:pPr>
-            <w:r>
-              <w:rPr/>
-              <w:t>X</w:t>
+            <w:tcW w:w="1081" w:type="dxa"/>
+            <w:tcBorders>
+              <w:start w:val="single" w:sz="4" w:space="0" w:color="000000"/>
+              <w:bottom w:val="single" w:sz="4" w:space="0" w:color="000000"/>
+            </w:tcBorders>
+          </w:tcPr>
+          <w:p>
+            <w:pPr>
+              <w:pStyle w:val="TableContents"/>
+              <w:spacing w:before="0" w:after="200"/>
+              <w:jc w:val="center"/>
+              <w:rPr/>
+            </w:pPr>
+            <w:r>
+              <w:rPr/>
             </w:r>
           </w:p>
         </w:tc>
@@ -1551,47 +1463,47 @@
         <w:trPr/>
         <w:tc>
           <w:tcPr>
-            <w:tcW w:w="5055" w:type="dxa"/>
-            <w:tcBorders>
-              <w:start w:val="single" w:sz="4" w:space="0" w:color="000000"/>
-              <w:bottom w:val="single" w:sz="4" w:space="0" w:color="000000"/>
-            </w:tcBorders>
-          </w:tcPr>
-          <w:p>
-            <w:pPr>
-              <w:pStyle w:val="TableContents"/>
-              <w:spacing w:before="0" w:after="200"/>
-              <w:rPr/>
-            </w:pPr>
-            <w:r>
-              <w:rPr/>
-              <w:t>Revisão da escrita</w:t>
-            </w:r>
-          </w:p>
-        </w:tc>
-        <w:tc>
-          <w:tcPr>
-            <w:tcW w:w="735" w:type="dxa"/>
-            <w:tcBorders>
-              <w:start w:val="single" w:sz="4" w:space="0" w:color="000000"/>
-              <w:bottom w:val="single" w:sz="4" w:space="0" w:color="000000"/>
-            </w:tcBorders>
-          </w:tcPr>
-          <w:p>
-            <w:pPr>
-              <w:pStyle w:val="TableContents"/>
-              <w:spacing w:before="0" w:after="200"/>
-              <w:jc w:val="center"/>
-              <w:rPr/>
-            </w:pPr>
-            <w:r>
-              <w:rPr/>
-            </w:r>
-          </w:p>
-        </w:tc>
-        <w:tc>
-          <w:tcPr>
-            <w:tcW w:w="1080" w:type="dxa"/>
+            <w:tcW w:w="5054" w:type="dxa"/>
+            <w:tcBorders>
+              <w:start w:val="single" w:sz="4" w:space="0" w:color="000000"/>
+              <w:bottom w:val="single" w:sz="4" w:space="0" w:color="000000"/>
+            </w:tcBorders>
+          </w:tcPr>
+          <w:p>
+            <w:pPr>
+              <w:pStyle w:val="TableContents"/>
+              <w:spacing w:before="0" w:after="200"/>
+              <w:rPr/>
+            </w:pPr>
+            <w:r>
+              <w:rPr/>
+              <w:t>Escrever artigo</w:t>
+            </w:r>
+          </w:p>
+        </w:tc>
+        <w:tc>
+          <w:tcPr>
+            <w:tcW w:w="736" w:type="dxa"/>
+            <w:tcBorders>
+              <w:start w:val="single" w:sz="4" w:space="0" w:color="000000"/>
+              <w:bottom w:val="single" w:sz="4" w:space="0" w:color="000000"/>
+            </w:tcBorders>
+          </w:tcPr>
+          <w:p>
+            <w:pPr>
+              <w:pStyle w:val="TableContents"/>
+              <w:spacing w:before="0" w:after="200"/>
+              <w:jc w:val="center"/>
+              <w:rPr/>
+            </w:pPr>
+            <w:r>
+              <w:rPr/>
+            </w:r>
+          </w:p>
+        </w:tc>
+        <w:tc>
+          <w:tcPr>
+            <w:tcW w:w="1079" w:type="dxa"/>
             <w:tcBorders>
               <w:start w:val="single" w:sz="4" w:space="0" w:color="000000"/>
               <w:bottom w:val="single" w:sz="4" w:space="0" w:color="000000"/>
@@ -1631,21 +1543,22 @@
         </w:tc>
         <w:tc>
           <w:tcPr>
-            <w:tcW w:w="1080" w:type="dxa"/>
-            <w:tcBorders>
-              <w:start w:val="single" w:sz="4" w:space="0" w:color="000000"/>
-              <w:bottom w:val="single" w:sz="4" w:space="0" w:color="000000"/>
-            </w:tcBorders>
-          </w:tcPr>
-          <w:p>
-            <w:pPr>
-              <w:pStyle w:val="TableContents"/>
-              <w:spacing w:before="0" w:after="200"/>
-              <w:jc w:val="center"/>
-              <w:rPr/>
-            </w:pPr>
-            <w:r>
-              <w:rPr/>
+            <w:tcW w:w="1081" w:type="dxa"/>
+            <w:tcBorders>
+              <w:start w:val="single" w:sz="4" w:space="0" w:color="000000"/>
+              <w:bottom w:val="single" w:sz="4" w:space="0" w:color="000000"/>
+            </w:tcBorders>
+          </w:tcPr>
+          <w:p>
+            <w:pPr>
+              <w:pStyle w:val="TableContents"/>
+              <w:spacing w:before="0" w:after="200"/>
+              <w:jc w:val="center"/>
+              <w:rPr/>
+            </w:pPr>
+            <w:r>
+              <w:rPr/>
+              <w:t>X</w:t>
             </w:r>
           </w:p>
         </w:tc>
@@ -1867,7 +1780,7 @@
       <w:start w:val="1"/>
       <w:numFmt w:val="none"/>
       <w:suff w:val="nothing"/>
-      <w:lvlText w:val="%1"/>
+      <w:lvlText w:val=""/>
       <w:lvlJc w:val="start"/>
       <w:pPr>
         <w:tabs>
@@ -1880,7 +1793,7 @@
       <w:start w:val="1"/>
       <w:numFmt w:val="none"/>
       <w:suff w:val="nothing"/>
-      <w:lvlText w:val="%2"/>
+      <w:lvlText w:val=""/>
       <w:lvlJc w:val="start"/>
       <w:pPr>
         <w:tabs>
@@ -1893,7 +1806,7 @@
       <w:start w:val="1"/>
       <w:numFmt w:val="none"/>
       <w:suff w:val="nothing"/>
-      <w:lvlText w:val="%3"/>
+      <w:lvlText w:val=""/>
       <w:lvlJc w:val="start"/>
       <w:pPr>
         <w:tabs>
@@ -1906,7 +1819,7 @@
       <w:start w:val="1"/>
       <w:numFmt w:val="none"/>
       <w:suff w:val="nothing"/>
-      <w:lvlText w:val="%4"/>
+      <w:lvlText w:val=""/>
       <w:lvlJc w:val="start"/>
       <w:pPr>
         <w:tabs>
@@ -1919,7 +1832,7 @@
       <w:start w:val="1"/>
       <w:numFmt w:val="none"/>
       <w:suff w:val="nothing"/>
-      <w:lvlText w:val="%5"/>
+      <w:lvlText w:val=""/>
       <w:lvlJc w:val="start"/>
       <w:pPr>
         <w:tabs>
@@ -1932,7 +1845,7 @@
       <w:start w:val="1"/>
       <w:numFmt w:val="none"/>
       <w:suff w:val="nothing"/>
-      <w:lvlText w:val="%6"/>
+      <w:lvlText w:val=""/>
       <w:lvlJc w:val="start"/>
       <w:pPr>
         <w:tabs>
@@ -1945,7 +1858,7 @@
       <w:start w:val="1"/>
       <w:numFmt w:val="none"/>
       <w:suff w:val="nothing"/>
-      <w:lvlText w:val="%7"/>
+      <w:lvlText w:val=""/>
       <w:lvlJc w:val="start"/>
       <w:pPr>
         <w:tabs>
@@ -1958,7 +1871,7 @@
       <w:start w:val="1"/>
       <w:numFmt w:val="none"/>
       <w:suff w:val="nothing"/>
-      <w:lvlText w:val="%8"/>
+      <w:lvlText w:val=""/>
       <w:lvlJc w:val="start"/>
       <w:pPr>
         <w:tabs>
@@ -1971,7 +1884,7 @@
       <w:start w:val="1"/>
       <w:numFmt w:val="none"/>
       <w:suff w:val="nothing"/>
-      <w:lvlText w:val="%9"/>
+      <w:lvlText w:val=""/>
       <w:lvlJc w:val="start"/>
       <w:pPr>
         <w:tabs>
@@ -2012,18 +1925,19 @@
     <w:qFormat/>
     <w:pPr>
       <w:widowControl/>
-      <w:kinsoku w:val="true"/>
-      <w:overflowPunct w:val="true"/>
-      <w:autoSpaceDE w:val="true"/>
+      <w:suppressAutoHyphens w:val="true"/>
+      <w:overflowPunct w:val="false"/>
       <w:bidi w:val="0"/>
       <w:spacing w:lineRule="auto" w:line="276" w:before="0" w:after="200"/>
+      <w:jc w:val="start"/>
     </w:pPr>
     <w:rPr>
       <w:rFonts w:ascii="Calibri" w:hAnsi="Calibri" w:eastAsia="Calibri" w:cs="Times New Roman"/>
       <w:color w:val="auto"/>
+      <w:kern w:val="0"/>
       <w:sz w:val="22"/>
       <w:szCs w:val="22"/>
-      <w:lang w:val="pt-BR" w:bidi="ar-SA" w:eastAsia="zh-CN"/>
+      <w:lang w:val="pt-BR" w:eastAsia="zh-CN" w:bidi="ar-SA"/>
     </w:rPr>
   </w:style>
   <w:style w:type="character" w:styleId="Fontepargpadro">
@@ -2040,8 +1954,8 @@
       <w:szCs w:val="16"/>
     </w:rPr>
   </w:style>
-  <w:style w:type="character" w:styleId="Bullets">
-    <w:name w:val="Bullets"/>
+  <w:style w:type="character" w:styleId="Bulletsuser">
+    <w:name w:val="Bullets (user)"/>
     <w:qFormat/>
     <w:rPr>
       <w:rFonts w:ascii="OpenSymbol" w:hAnsi="OpenSymbol" w:eastAsia="OpenSymbol" w:cs="OpenSymbol"/>

</xml_diff>